<commit_message>
Découvrir la CGT : de 2 à 10 participant·es (10 au maximum)
Remplace « 6 à 10 personnes » sur la page et dans le guide Word de
l'animateur·ice. Cache du service worker en v10.

Co-Authored-By: Claude Opus 5.5 <noreply@anthropic.com>
Claude-Session: https://claude.ai/code/session_016rL7B113spoLeSBdGwEbaY
</commit_message>
<xml_diff>
--- a/documents/Decouvrir_la_CGT_Guide_animateur.docx
+++ b/documents/Decouvrir_la_CGT_Guide_animateur.docx
@@ -375,7 +375,7 @@
         <w:spacing w:after="60"/>
       </w:pPr>
       <w:r>
-        <w:t xml:space="preserve">Six à dix personnes, deux animateur·ices au maximum, en cercle autour d'une table.</w:t>
+        <w:t xml:space="preserve">De 2 à 10 personnes, 10 au maximum pour que chacun·e puisse parler ; deux animateur·ices au maximum, en cercle autour d'une table.</w:t>
       </w:r>
     </w:p>
     <w:p>
@@ -417,7 +417,7 @@
         <w:spacing w:after="60"/>
       </w:pPr>
       <w:r>
-        <w:t xml:space="preserve">Inviter : flyer A5, affiche A4 ou A3, bouche-à-oreille. Viser 6 à 10 personnes.</w:t>
+        <w:t xml:space="preserve">Inviter : flyer A5, affiche A4 ou A3, bouche-à-oreille. Viser de 2 à 10 personnes (10 au maximum).</w:t>
       </w:r>
     </w:p>
     <w:p>

</xml_diff>